<commit_message>
Adds the fine-tune process
</commit_message>
<xml_diff>
--- a/documents/Commands.docx
+++ b/documents/Commands.docx
@@ -1508,6 +1508,162 @@
       </w:r>
     </w:p>
     <w:p/>
+    <w:p>
+      <w:r>
+        <w:pict w14:anchorId="36E3FBFB">
+          <v:rect id="_x0000_i1030" style="width:0;height:1.5pt" o:hralign="center" o:hrstd="t" o:hr="t" fillcolor="#a0a0a0" stroked="f"/>
+        </w:pict>
+      </w:r>
+    </w:p>
+    <w:p>
+      <w:r>
+        <w:rPr>
+          <w:rFonts w:hint="eastAsia"/>
+        </w:rPr>
+        <w:t>Fine Tune</w:t>
+      </w:r>
+    </w:p>
+    <w:p>
+      <w:pPr>
+        <w:rPr>
+          <w:i/>
+          <w:iCs/>
+        </w:rPr>
+      </w:pPr>
+      <w:r>
+        <w:rPr>
+          <w:i/>
+          <w:iCs/>
+        </w:rPr>
+        <w:t>python finetune.py --</w:t>
+      </w:r>
+      <w:proofErr w:type="spellStart"/>
+      <w:r>
+        <w:rPr>
+          <w:i/>
+          <w:iCs/>
+        </w:rPr>
+        <w:t>dataset_name</w:t>
+      </w:r>
+      <w:proofErr w:type="spellEnd"/>
+      <w:r>
+        <w:rPr>
+          <w:i/>
+          <w:iCs/>
+        </w:rPr>
+        <w:t xml:space="preserve"> </w:t>
+      </w:r>
+      <w:proofErr w:type="spellStart"/>
+      <w:r>
+        <w:rPr>
+          <w:i/>
+          <w:iCs/>
+        </w:rPr>
+        <w:t>twoPeople</w:t>
+      </w:r>
+      <w:r>
+        <w:rPr>
+          <w:rFonts w:hint="eastAsia"/>
+          <w:i/>
+          <w:iCs/>
+        </w:rPr>
+        <w:t>_test</w:t>
+      </w:r>
+      <w:proofErr w:type="spellEnd"/>
+      <w:r>
+        <w:rPr>
+          <w:i/>
+          <w:iCs/>
+        </w:rPr>
+        <w:t xml:space="preserve"> --</w:t>
+      </w:r>
+      <w:proofErr w:type="spellStart"/>
+      <w:r>
+        <w:rPr>
+          <w:i/>
+          <w:iCs/>
+        </w:rPr>
+        <w:t>hp_config</w:t>
+      </w:r>
+      <w:proofErr w:type="spellEnd"/>
+      <w:r>
+        <w:rPr>
+          <w:i/>
+          <w:iCs/>
+        </w:rPr>
+        <w:t xml:space="preserve"> config/</w:t>
+      </w:r>
+      <w:r>
+        <w:rPr>
+          <w:rFonts w:hint="eastAsia"/>
+          <w:i/>
+          <w:iCs/>
+        </w:rPr>
+        <w:t>all</w:t>
+      </w:r>
+      <w:r>
+        <w:rPr>
+          <w:i/>
+          <w:iCs/>
+        </w:rPr>
+        <w:t>.py --pretrained checkpoint/</w:t>
+      </w:r>
+      <w:proofErr w:type="spellStart"/>
+      <w:r>
+        <w:rPr>
+          <w:i/>
+          <w:iCs/>
+        </w:rPr>
+        <w:t>sdd</w:t>
+      </w:r>
+      <w:proofErr w:type="spellEnd"/>
+      <w:r>
+        <w:rPr>
+          <w:i/>
+          <w:iCs/>
+        </w:rPr>
+        <w:t>/</w:t>
+      </w:r>
+      <w:proofErr w:type="spellStart"/>
+      <w:r>
+        <w:rPr>
+          <w:i/>
+          <w:iCs/>
+        </w:rPr>
+        <w:t>best.pth</w:t>
+      </w:r>
+      <w:proofErr w:type="spellEnd"/>
+      <w:r>
+        <w:rPr>
+          <w:i/>
+          <w:iCs/>
+        </w:rPr>
+        <w:t xml:space="preserve"> --checkpoint checkpoint/ --</w:t>
+      </w:r>
+      <w:proofErr w:type="spellStart"/>
+      <w:r>
+        <w:rPr>
+          <w:i/>
+          <w:iCs/>
+        </w:rPr>
+        <w:t>gpu</w:t>
+      </w:r>
+      <w:proofErr w:type="spellEnd"/>
+      <w:r>
+        <w:rPr>
+          <w:i/>
+          <w:iCs/>
+        </w:rPr>
+        <w:t xml:space="preserve"> 0</w:t>
+      </w:r>
+    </w:p>
+    <w:p>
+      <w:pPr>
+        <w:rPr>
+          <w:rFonts w:hint="eastAsia"/>
+        </w:rPr>
+      </w:pPr>
+    </w:p>
     <w:sectPr>
       <w:pgSz w:w="12240" w:h="15840"/>
       <w:pgMar w:top="1440" w:right="1440" w:bottom="1440" w:left="1440" w:header="720" w:footer="720" w:gutter="0"/>
@@ -2171,7 +2327,6 @@
   <w:style w:type="character" w:default="1" w:styleId="DefaultParagraphFont">
     <w:name w:val="Default Paragraph Font"/>
     <w:uiPriority w:val="1"/>
-    <w:semiHidden/>
     <w:unhideWhenUsed/>
   </w:style>
   <w:style w:type="table" w:default="1" w:styleId="TableNormal">

</xml_diff>